<commit_message>
feat: render DOCX charts and WMF images in the reader
Native Office charts and Windows metafiles were left blank by docx-preview; rasterize them to PNG before preview and align the DOCX search panel with PPTX so body-led reports stay readable.

Co-authored-by: Cursor <cursoragent@cursor.com>
</commit_message>
<xml_diff>
--- a/tests/fixtures/docx-exploration/unavailable-content.docx
+++ b/tests/fixtures/docx-exploration/unavailable-content.docx
@@ -1,6 +1,6 @@
 
 <file path=word/document.xml><?xml version="1.0" encoding="utf-8"?>
-<w:document xmlns:w="http://schemas.openxmlformats.org/wordprocessingml/2006/main" xmlns:w14="http://schemas.microsoft.com/office/word/2010/wordml" xmlns:r="http://schemas.openxmlformats.org/officeDocument/2006/relationships" xmlns:m="http://schemas.openxmlformats.org/officeDocument/2006/math" xmlns:a="http://schemas.openxmlformats.org/drawingml/2006/main" xmlns:wp="http://schemas.openxmlformats.org/drawingml/2006/wordprocessingDrawing" xmlns:pic="http://schemas.openxmlformats.org/drawingml/2006/picture">
+<w:document xmlns:w="http://schemas.openxmlformats.org/wordprocessingml/2006/main" xmlns:w14="http://schemas.microsoft.com/office/word/2010/wordml" xmlns:r="http://schemas.openxmlformats.org/officeDocument/2006/relationships" xmlns:m="http://schemas.openxmlformats.org/officeDocument/2006/math" xmlns:a="http://schemas.openxmlformats.org/drawingml/2006/main" xmlns:wp="http://schemas.openxmlformats.org/drawingml/2006/wordprocessingDrawing" xmlns:pic="http://schemas.openxmlformats.org/drawingml/2006/picture" xmlns:c="http://schemas.openxmlformats.org/drawingml/2006/chart">
   <w:body>
     <w:p>
       <w:r>
@@ -27,6 +27,20 @@
       <w:r>
         <w:drawing>
           <a:blip r:embed="rExternalImage"/>
+        </w:drawing>
+      </w:r>
+    </w:p>
+    <w:p>
+      <w:r>
+        <w:drawing>
+          <wp:inline>
+            <wp:extent cx="5486400" cy="3200400"/>
+            <a:graphic>
+              <a:graphicData uri="http://schemas.openxmlformats.org/drawingml/2006/chart">
+                <c:chart r:id="rChart"/>
+              </a:graphicData>
+            </a:graphic>
+          </wp:inline>
         </w:drawing>
       </w:r>
     </w:p>
@@ -72,4 +86,10 @@
     </w:pPr>
   </w:style>
 </w:styles>
+</file>
+
+<file path=word/charts/chart1.xml><?xml version="1.0" encoding="utf-8"?>
+<c:chartSpace xmlns:c="http://schemas.openxmlformats.org/drawingml/2006/chart">
+  <c:chart/>
+</c:chartSpace>
 </file>
</xml_diff>